<commit_message>
fix: smarter list detection + regenerated sample template matching customer format
</commit_message>
<xml_diff>
--- a/public/templates/mau-giay-moi.docx
+++ b/public/templates/mau-giay-moi.docx
@@ -47,6 +47,49 @@
     </w:p>
     <w:p>
       <w:pPr>
+        <w:jc w:val="center"/>
+        <w:rPr>
+          <w:b/>
+          <w:sz w:val="26"/>
+          <w:szCs w:val="26"/>
+        </w:rPr>
+      </w:pPr>
+      <w:r>
+        <w:rPr>
+          <w:b/>
+          <w:sz w:val="26"/>
+          <w:szCs w:val="26"/>
+        </w:rPr>
+        <w:t xml:space="preserve">CỘNG HÒA XÃ HỘI CHỦ NGHĨA VIỆT NAM</w:t>
+      </w:r>
+    </w:p>
+    <w:p>
+      <w:pPr>
+        <w:jc w:val="center"/>
+        <w:rPr>
+          <w:b/>
+          <w:u w:val="single"/>
+          <w:sz w:val="26"/>
+          <w:szCs w:val="26"/>
+        </w:rPr>
+      </w:pPr>
+      <w:r>
+        <w:rPr>
+          <w:b/>
+          <w:u w:val="single"/>
+          <w:sz w:val="26"/>
+          <w:szCs w:val="26"/>
+        </w:rPr>
+        <w:t xml:space="preserve">Độc lập - Tự do - Hạnh phúc</w:t>
+      </w:r>
+    </w:p>
+    <w:p>
+      <w:r>
+        <w:t xml:space="preserve"/>
+      </w:r>
+    </w:p>
+    <w:p>
+      <w:pPr>
         <w:rPr>
           <w:sz w:val="24"/>
           <w:szCs w:val="24"/>
@@ -63,12 +106,14 @@
     <w:p>
       <w:pPr>
         <w:rPr>
-          <w:sz w:val="24"/>
-          <w:szCs w:val="24"/>
-        </w:rPr>
-      </w:pPr>
-      <w:r>
-        <w:rPr>
+          <w:i/>
+          <w:sz w:val="24"/>
+          <w:szCs w:val="24"/>
+        </w:rPr>
+      </w:pPr>
+      <w:r>
+        <w:rPr>
+          <w:i/>
           <w:sz w:val="24"/>
           <w:szCs w:val="24"/>
         </w:rPr>
@@ -99,88 +144,93 @@
       </w:r>
     </w:p>
     <w:p>
-      <w:r>
-        <w:t xml:space="preserve"/>
-      </w:r>
-    </w:p>
-    <w:p>
-      <w:pPr>
-        <w:jc w:val="center"/>
-        <w:rPr>
-          <w:sz w:val="24"/>
-          <w:szCs w:val="24"/>
-        </w:rPr>
-      </w:pPr>
-      <w:r>
-        <w:rPr>
-          <w:sz w:val="24"/>
-          <w:szCs w:val="24"/>
-        </w:rPr>
-        <w:t xml:space="preserve">[VỀ VIỆC]</w:t>
-      </w:r>
-    </w:p>
-    <w:p>
-      <w:r>
-        <w:t xml:space="preserve"/>
-      </w:r>
-    </w:p>
-    <w:p>
-      <w:pPr>
-        <w:rPr>
-          <w:sz w:val="24"/>
-          <w:szCs w:val="24"/>
-        </w:rPr>
-      </w:pPr>
-      <w:r>
-        <w:rPr>
-          <w:sz w:val="24"/>
-          <w:szCs w:val="24"/>
-        </w:rPr>
-        <w:t xml:space="preserve">Ủy ban nhân dân xã Kỳ Xuân tổ chức hội nghị thống nhất một số nội dung. Kính mời các đại biểu tham dự:</w:t>
-      </w:r>
-    </w:p>
-    <w:p>
-      <w:r>
-        <w:t xml:space="preserve"/>
-      </w:r>
-    </w:p>
-    <w:p>
-      <w:pPr>
-        <w:rPr>
-          <w:sz w:val="24"/>
-          <w:szCs w:val="24"/>
-        </w:rPr>
-      </w:pPr>
-      <w:r>
-        <w:rPr>
-          <w:sz w:val="24"/>
-          <w:szCs w:val="24"/>
-        </w:rPr>
-        <w:t xml:space="preserve">1. Thời gian Hội nghị: [THỜI GIAN]</w:t>
-      </w:r>
-    </w:p>
-    <w:p>
-      <w:pPr>
-        <w:rPr>
-          <w:sz w:val="24"/>
-          <w:szCs w:val="24"/>
-        </w:rPr>
-      </w:pPr>
-      <w:r>
-        <w:rPr>
-          <w:sz w:val="24"/>
-          <w:szCs w:val="24"/>
-        </w:rPr>
-        <w:t xml:space="preserve">2. Địa điểm: [ĐỊA ĐIỂM]</w:t>
-      </w:r>
-    </w:p>
-    <w:p>
-      <w:r>
-        <w:t xml:space="preserve"/>
-      </w:r>
-    </w:p>
-    <w:p>
-      <w:pPr>
+      <w:pPr>
+        <w:jc w:val="center"/>
+        <w:rPr>
+          <w:sz w:val="24"/>
+          <w:szCs w:val="24"/>
+        </w:rPr>
+      </w:pPr>
+      <w:r>
+        <w:rPr>
+          <w:sz w:val="24"/>
+          <w:szCs w:val="24"/>
+        </w:rPr>
+        <w:t xml:space="preserve">[Về việc thống nhất một số nội dung chuẩn bị cho Đại hội Điền kinh]</w:t>
+      </w:r>
+    </w:p>
+    <w:p>
+      <w:r>
+        <w:t xml:space="preserve"/>
+      </w:r>
+    </w:p>
+    <w:p>
+      <w:pPr>
+        <w:ind w:left="360"/>
+        <w:rPr>
+          <w:sz w:val="24"/>
+          <w:szCs w:val="24"/>
+        </w:rPr>
+      </w:pPr>
+      <w:r>
+        <w:rPr>
+          <w:sz w:val="24"/>
+          <w:szCs w:val="24"/>
+        </w:rPr>
+        <w:t xml:space="preserve">Nhằm đảm bảo tốt cho công tác tham gia [Đại hội Điền kinh – Thể thao học sinh phổ thông cấp tỉnh năm học 2025 – 2026];</w:t>
+      </w:r>
+    </w:p>
+    <w:p>
+      <w:pPr>
+        <w:ind w:left="360"/>
+        <w:rPr>
+          <w:sz w:val="24"/>
+          <w:szCs w:val="24"/>
+        </w:rPr>
+      </w:pPr>
+      <w:r>
+        <w:rPr>
+          <w:sz w:val="24"/>
+          <w:szCs w:val="24"/>
+        </w:rPr>
+        <w:t xml:space="preserve">Ủy ban nhân dân xã Kỳ Xuân tổ chức hội nghị thống nhất một số nội dung liên quan đến công tác chuẩn bị và tham gia Đại hội.</w:t>
+      </w:r>
+    </w:p>
+    <w:p>
+      <w:pPr>
+        <w:ind w:left="360"/>
+        <w:rPr>
+          <w:sz w:val="24"/>
+          <w:szCs w:val="24"/>
+        </w:rPr>
+      </w:pPr>
+      <w:r>
+        <w:rPr>
+          <w:sz w:val="24"/>
+          <w:szCs w:val="24"/>
+        </w:rPr>
+        <w:t xml:space="preserve">1. Thời gian Hội nghị: [½ ngày, từ 15h00 ngày 17/3/2026.]</w:t>
+      </w:r>
+    </w:p>
+    <w:p>
+      <w:pPr>
+        <w:ind w:left="360"/>
+        <w:rPr>
+          <w:sz w:val="24"/>
+          <w:szCs w:val="24"/>
+        </w:rPr>
+      </w:pPr>
+      <w:r>
+        <w:rPr>
+          <w:sz w:val="24"/>
+          <w:szCs w:val="24"/>
+        </w:rPr>
+        <w:t xml:space="preserve">2. Địa điểm: [Tại Hội trường tầng 2, Trụ sở UBND xã Kỳ Xuân.]</w:t>
+      </w:r>
+    </w:p>
+    <w:p>
+      <w:pPr>
+        <w:ind w:left="360"/>
         <w:rPr>
           <w:b/>
           <w:sz w:val="24"/>
@@ -198,6 +248,7 @@
     </w:p>
     <w:p>
       <w:pPr>
+        <w:ind w:left="720"/>
         <w:rPr>
           <w:b/>
           <w:sz w:val="24"/>
@@ -215,21 +266,55 @@
     </w:p>
     <w:p>
       <w:pPr>
-        <w:rPr>
-          <w:sz w:val="24"/>
-          <w:szCs w:val="24"/>
-        </w:rPr>
-      </w:pPr>
-      <w:r>
-        <w:rPr>
-          <w:sz w:val="24"/>
-          <w:szCs w:val="24"/>
-        </w:rPr>
-        <w:t xml:space="preserve">[DANH_SACH_DAI_BIEU_XA]</w:t>
-      </w:r>
-    </w:p>
-    <w:p>
-      <w:pPr>
+        <w:ind w:left="720"/>
+        <w:rPr>
+          <w:sz w:val="24"/>
+          <w:szCs w:val="24"/>
+        </w:rPr>
+      </w:pPr>
+      <w:r>
+        <w:rPr>
+          <w:sz w:val="24"/>
+          <w:szCs w:val="24"/>
+        </w:rPr>
+        <w:t xml:space="preserve">- [Đồng chí Nguyễn Thành Chung, Phó Chủ tịch UBND xã (mời Chủ trì);]</w:t>
+      </w:r>
+    </w:p>
+    <w:p>
+      <w:pPr>
+        <w:ind w:left="720"/>
+        <w:rPr>
+          <w:sz w:val="24"/>
+          <w:szCs w:val="24"/>
+        </w:rPr>
+      </w:pPr>
+      <w:r>
+        <w:rPr>
+          <w:sz w:val="24"/>
+          <w:szCs w:val="24"/>
+        </w:rPr>
+        <w:t xml:space="preserve">- [Đồng chí Nguyễn Đình Tương, Trưởng phòng Phòng Văn hoá - Xã hội.]</w:t>
+      </w:r>
+    </w:p>
+    <w:p>
+      <w:pPr>
+        <w:ind w:left="720"/>
+        <w:rPr>
+          <w:sz w:val="24"/>
+          <w:szCs w:val="24"/>
+        </w:rPr>
+      </w:pPr>
+      <w:r>
+        <w:rPr>
+          <w:sz w:val="24"/>
+          <w:szCs w:val="24"/>
+        </w:rPr>
+        <w:t xml:space="preserve">- [Công chức phòng Văn hóa – Xã hội, phụ trách lĩnh vực Giáo dục.]</w:t>
+      </w:r>
+    </w:p>
+    <w:p>
+      <w:pPr>
+        <w:ind w:left="720"/>
         <w:rPr>
           <w:b/>
           <w:sz w:val="24"/>
@@ -247,26 +332,23 @@
     </w:p>
     <w:p>
       <w:pPr>
-        <w:rPr>
-          <w:sz w:val="24"/>
-          <w:szCs w:val="24"/>
-        </w:rPr>
-      </w:pPr>
-      <w:r>
-        <w:rPr>
-          <w:sz w:val="24"/>
-          <w:szCs w:val="24"/>
-        </w:rPr>
-        <w:t xml:space="preserve">[DANH_SACH_DAI_BIEU_TRUONG]</w:t>
-      </w:r>
-    </w:p>
-    <w:p>
-      <w:r>
-        <w:t xml:space="preserve"/>
-      </w:r>
-    </w:p>
-    <w:p>
-      <w:pPr>
+        <w:ind w:left="720"/>
+        <w:rPr>
+          <w:sz w:val="24"/>
+          <w:szCs w:val="24"/>
+        </w:rPr>
+      </w:pPr>
+      <w:r>
+        <w:rPr>
+          <w:sz w:val="24"/>
+          <w:szCs w:val="24"/>
+        </w:rPr>
+        <w:t xml:space="preserve">- [Ban giám hiệu các trường Tiểu học, Trung học cơ sở trên địa bàn.]</w:t>
+      </w:r>
+    </w:p>
+    <w:p>
+      <w:pPr>
+        <w:ind w:left="360"/>
         <w:rPr>
           <w:b/>
           <w:sz w:val="24"/>
@@ -284,17 +366,50 @@
     </w:p>
     <w:p>
       <w:pPr>
-        <w:rPr>
-          <w:sz w:val="24"/>
-          <w:szCs w:val="24"/>
-        </w:rPr>
-      </w:pPr>
-      <w:r>
-        <w:rPr>
-          <w:sz w:val="24"/>
-          <w:szCs w:val="24"/>
-        </w:rPr>
-        <w:t xml:space="preserve">[DANH_SACH_PHAN_CONG]</w:t>
+        <w:ind w:left="720"/>
+        <w:rPr>
+          <w:sz w:val="24"/>
+          <w:szCs w:val="24"/>
+        </w:rPr>
+      </w:pPr>
+      <w:r>
+        <w:rPr>
+          <w:sz w:val="24"/>
+          <w:szCs w:val="24"/>
+        </w:rPr>
+        <w:t xml:space="preserve">- [Phòng Văn hóa - Xã hội chuẩn bị các tài liệu phục vụ cho hội nghị;]</w:t>
+      </w:r>
+    </w:p>
+    <w:p>
+      <w:pPr>
+        <w:ind w:left="720"/>
+        <w:rPr>
+          <w:sz w:val="24"/>
+          <w:szCs w:val="24"/>
+        </w:rPr>
+      </w:pPr>
+      <w:r>
+        <w:rPr>
+          <w:sz w:val="24"/>
+          <w:szCs w:val="24"/>
+        </w:rPr>
+        <w:t xml:space="preserve">- [Văn Phòng HĐND&amp;UBND chuẩn bị các điều kiện phục vụ hội nghị.]</w:t>
+      </w:r>
+    </w:p>
+    <w:p>
+      <w:pPr>
+        <w:ind w:left="360"/>
+        <w:rPr>
+          <w:sz w:val="24"/>
+          <w:szCs w:val="24"/>
+        </w:rPr>
+      </w:pPr>
+      <w:r>
+        <w:rPr>
+          <w:sz w:val="24"/>
+          <w:szCs w:val="24"/>
+        </w:rPr>
+        <w:t xml:space="preserve">Đề nghị các đại biểu tham dự kỳ họp đầy đủ và đúng thời gian quy định./.</w:t>
       </w:r>
     </w:p>
     <w:p>
@@ -326,13 +441,15 @@
       <w:pPr>
         <w:rPr>
           <w:b/>
-          <w:sz w:val="20"/>
-          <w:szCs w:val="20"/>
-        </w:rPr>
-      </w:pPr>
-      <w:r>
-        <w:rPr>
-          <w:b/>
+          <w:i/>
+          <w:sz w:val="20"/>
+          <w:szCs w:val="20"/>
+        </w:rPr>
+      </w:pPr>
+      <w:r>
+        <w:rPr>
+          <w:b/>
+          <w:i/>
           <w:sz w:val="20"/>
           <w:szCs w:val="20"/>
         </w:rPr>
@@ -396,22 +513,22 @@
           <w:sz w:val="20"/>
           <w:szCs w:val="20"/>
         </w:rPr>
-        <w:t xml:space="preserve">- Phòng Văn hóa - XH;</w:t>
-      </w:r>
-    </w:p>
-    <w:p>
-      <w:pPr>
-        <w:rPr>
-          <w:sz w:val="20"/>
-          <w:szCs w:val="20"/>
-        </w:rPr>
-      </w:pPr>
-      <w:r>
-        <w:rPr>
-          <w:sz w:val="20"/>
-          <w:szCs w:val="20"/>
-        </w:rPr>
-        <w:t xml:space="preserve">- Lưu VT.</w:t>
+        <w:t xml:space="preserve">- Phòng Văn hóa – Xã hội;</w:t>
+      </w:r>
+    </w:p>
+    <w:p>
+      <w:pPr>
+        <w:rPr>
+          <w:sz w:val="20"/>
+          <w:szCs w:val="20"/>
+        </w:rPr>
+      </w:pPr>
+      <w:r>
+        <w:rPr>
+          <w:sz w:val="20"/>
+          <w:szCs w:val="20"/>
+        </w:rPr>
+        <w:t xml:space="preserve">- Lưu VT./.</w:t>
       </w:r>
     </w:p>
     <w:p>
@@ -478,7 +595,7 @@
           <w:sz w:val="24"/>
           <w:szCs w:val="24"/>
         </w:rPr>
-        <w:t xml:space="preserve">[NGƯỜI KÝ]</w:t>
+        <w:t xml:space="preserve">[Nguyễn Văn Yên]</w:t>
       </w:r>
     </w:p>
   </w:body>

</xml_diff>